<commit_message>
docs: extend 2026-06-05 session report with refactor + scaling; README structure now real
Co-Authored-By: Claude Opus 4.8 (1M context) <noreply@anthropic.com>
</commit_message>
<xml_diff>
--- a/docs/session-2026-06-05.docx
+++ b/docs/session-2026-06-05.docx
@@ -984,7 +984,7 @@
         <w:pStyle w:val="Heading2"/>
       </w:pPr>
       <w:r>
-        <w:t xml:space="preserve">Next</w:t>
+        <w:t xml:space="preserve">Afternoon: refactor into the speechlab package</w:t>
       </w:r>
     </w:p>
     <w:p>
@@ -992,7 +992,83 @@
         <w:spacing w:after="80"/>
       </w:pPr>
       <w:r>
-        <w:t xml:space="preserve">Refactor fluency_features, mtld and the evaluation helpers into src/ modules with pytest fixtures, then scale to the full dev set (3,249 responses), where the prosody and WER–proficiency questions get a real sample size.</w:t>
+        <w:t xml:space="preserve">With two notebooks of duplicated helpers, I extracted the proven code into a proper src-layout package (src/speechlab/): data (corpus loading, the notebook-01 stratified sampler), asr (transcription with a resumable JSON cache, STM parsing, lenient/strict WER), acoustic_features (fluency from word timestamps, prosody via parselmouth), text_features (token normalisation, TTR, MTLD) and evaluation (grid snapping, the five-metric scorer report). Heavy imports (faster-whisper, jiwer, parselmouth) are lazy, so the package imports cleanly in any context. Notebooks 01 and 02 stay frozen as session records; new work imports the package.</w:t>
+      </w:r>
+    </w:p>
+    <w:p>
+      <w:pPr>
+        <w:spacing w:after="80"/>
+      </w:pPr>
+      <w:r>
+        <w:t xml:space="preserve">Two quality gates before committing:</w:t>
+      </w:r>
+    </w:p>
+    <w:p>
+      <w:pPr>
+        <w:pStyle w:val="ListParagraph"/>
+        <w:numPr>
+          <w:ilvl w:val="0"/>
+          <w:numId w:val="3"/>
+        </w:numPr>
+        <w:spacing w:after="80"/>
+      </w:pPr>
+      <w:r>
+        <w:rPr>
+          <w:b/>
+          <w:bCs/>
+          <w:i w:val="false"/>
+          <w:iCs w:val="false"/>
+        </w:rPr>
+        <w:t xml:space="preserve">A 23-test pytest suite on entirely synthetic fixtures</w:t>
+      </w:r>
+      <w:r>
+        <w:t xml:space="preserve"> — generated sine waves for prosody (the 220 Hz tone must come back as f0 ≈ 220), hand-written STM text, known-value MTLD and QWK cases. No corpus data appears in tests, keeping the licence boundary intact.</w:t>
+      </w:r>
+    </w:p>
+    <w:p>
+      <w:pPr>
+        <w:pStyle w:val="ListParagraph"/>
+        <w:numPr>
+          <w:ilvl w:val="0"/>
+          <w:numId w:val="3"/>
+        </w:numPr>
+        <w:spacing w:after="80"/>
+      </w:pPr>
+      <w:r>
+        <w:rPr>
+          <w:b/>
+          <w:bCs/>
+          <w:i w:val="false"/>
+          <w:iCs w:val="false"/>
+        </w:rPr>
+        <w:t xml:space="preserve">An equivalence check</w:t>
+      </w:r>
+      <w:r>
+        <w:t xml:space="preserve">: the package reproduces notebook 02’s results (QWK 0.621 / 0.647 / 0.644) to the third decimal — the refactor changed structure, not behaviour.</w:t>
+      </w:r>
+    </w:p>
+    <w:p>
+      <w:pPr>
+        <w:spacing w:after="80"/>
+      </w:pPr>
+      <w:r>
+        <w:t xml:space="preserve">The tests immediately earned their keep: MTLD returned 0 for text so diverse it never completes a factor — maximally diverse text scored as minimally diverse. Unreachable on real speech (function words always repeat), so notebook 02’s numbers stand, but the boundary is now correct (caps at text length) and pinned by a test.</w:t>
+      </w:r>
+    </w:p>
+    <w:p>
+      <w:pPr>
+        <w:pStyle w:val="Heading2"/>
+      </w:pPr>
+      <w:r>
+        <w:t xml:space="preserve">Scaling started</w:t>
+      </w:r>
+    </w:p>
+    <w:p>
+      <w:pPr>
+        <w:spacing w:after="80"/>
+      </w:pPr>
+      <w:r>
+        <w:t xml:space="preserve">scripts/transcribe_dev.py is transcribing all 5,616 scored dev responses (resumable per-part JSON cache, long-turn parts P3/P4 first) — several hours of CPU time running in the background. Notebook 03 picks this up: full-dev-set models, text features, Random Forest and MLP against the Ridge baseline.</w:t>
       </w:r>
     </w:p>
     <w:sectPr>
@@ -1203,6 +1279,12 @@
   </w:num>
   <w:num w:numId="2">
     <w:abstractNumId w:val="3"/>
+    <w:lvlOverride w:ilvl="0">
+      <w:startOverride w:val="1"/>
+    </w:lvlOverride>
+  </w:num>
+  <w:num w:numId="3">
+    <w:abstractNumId w:val="2"/>
     <w:lvlOverride w:ilvl="0">
       <w:startOverride w:val="1"/>
     </w:lvlOverride>

</xml_diff>

<commit_message>
docs: 2026-06-05 report closed out with deliverables section; journal entry completed
Co-Authored-By: Claude Opus 4.8 (1M context) <noreply@anthropic.com>
</commit_message>
<xml_diff>
--- a/docs/session-2026-06-05.docx
+++ b/docs/session-2026-06-05.docx
@@ -1238,6 +1238,42 @@
         <w:pStyle w:val="Heading2"/>
       </w:pPr>
       <w:r>
+        <w:t xml:space="preserve">The deliverables (reports)</w:t>
+      </w:r>
+    </w:p>
+    <w:p>
+      <w:pPr>
+        <w:spacing w:after="80"/>
+      </w:pPr>
+      <w:r>
+        <w:t xml:space="preserve">I closed the core roadmap by writing the project’s actual product: reports/model_card.md (Mitchell et al. structure — intended use, metrics under speaker-grouped CV, four named failure modes, fairness with the L1 limitation stated) and reports/evaluation_report.md (executive summary of the five findings that outrank the headline, word-count-baseline framing, the band-compression analysis, the two-notebook ASR-propagation arc, threats to validity, recommendations). Every figure traces to a notebook output; aggregates only, per the licence rules.</w:t>
+      </w:r>
+    </w:p>
+    <w:p>
+      <w:pPr>
+        <w:spacing w:after="80"/>
+      </w:pPr>
+      <w:r>
+        <w:t xml:space="preserve">One framing decision I would defend in an interview: the evaluation report’s first recommendation is that any future model must be benchmarked against the </w:t>
+      </w:r>
+      <w:r>
+        <w:rPr>
+          <w:b/>
+          <w:bCs/>
+          <w:i w:val="false"/>
+          <w:iCs w:val="false"/>
+        </w:rPr>
+        <w:t xml:space="preserve">word-count baseline</w:t>
+      </w:r>
+      <w:r>
+        <w:t xml:space="preserve"> (QWK 0.500), not the mean predictor — because word count captures ~90% of the achievable agreement, and beating zero is not evidence of anything.</w:t>
+      </w:r>
+    </w:p>
+    <w:p>
+      <w:pPr>
+        <w:pStyle w:val="Heading2"/>
+      </w:pPr>
+      <w:r>
         <w:t xml:space="preserve">Next</w:t>
       </w:r>
     </w:p>
@@ -1246,7 +1282,7 @@
         <w:spacing w:after="80"/>
       </w:pPr>
       <w:r>
-        <w:t xml:space="preserve">The written deliverables — reports/model_card.md and reports/evaluation_report.md — assembled from the four notebooks. Then, as extensions: LLM-derived text features (pending API access), P1/P5 short responses (transcription still running), wav2vec2 embeddings and SHAP as stretch goals.</w:t>
+        <w:t xml:space="preserve">Extensions only: LLM-derived text features (pending API access), P1/P5 short responses and a thicker audio-quality slice once transcription completes, wav2vec2/SHAP stretch goals, and the project wrap-up (knowledge quiz, role mapping).</w:t>
       </w:r>
     </w:p>
     <w:sectPr>

</xml_diff>